<commit_message>
Commiting the Source code
</commit_message>
<xml_diff>
--- a/OMMS_Objective.docx
+++ b/OMMS_Objective.docx
@@ -1,6 +1,6 @@
 
 <file path=word/document.xml><?xml version="1.0" encoding="utf-8"?>
-<w:document xmlns:wpc="http://schemas.microsoft.com/office/word/2010/wordprocessingCanvas" xmlns:cx="http://schemas.microsoft.com/office/drawing/2014/chartex" xmlns:cx1="http://schemas.microsoft.com/office/drawing/2015/9/8/chartex" xmlns:cx2="http://schemas.microsoft.com/office/drawing/2015/10/21/chartex" xmlns:cx3="http://schemas.microsoft.com/office/drawing/2016/5/9/chartex" xmlns:cx4="http://schemas.microsoft.com/office/drawing/2016/5/10/chartex" xmlns:cx5="http://schemas.microsoft.com/office/drawing/2016/5/11/chartex" xmlns:cx6="http://schemas.microsoft.com/office/drawing/2016/5/12/chartex" xmlns:cx7="http://schemas.microsoft.com/office/drawing/2016/5/13/chartex" xmlns:cx8="http://schemas.microsoft.com/office/drawing/2016/5/14/chartex" xmlns:mc="http://schemas.openxmlformats.org/markup-compatibility/2006" xmlns:aink="http://schemas.microsoft.com/office/drawing/2016/ink" xmlns:am3d="http://schemas.microsoft.com/office/drawing/2017/model3d" xmlns:o="urn:schemas-microsoft-com:office:office" xmlns:oel="http://schemas.microsoft.com/office/2019/extlst" xmlns:r="http://schemas.openxmlformats.org/officeDocument/2006/relationships" xmlns:m="http://schemas.openxmlformats.org/officeDocument/2006/math" xmlns:v="urn:schemas-microsoft-com:vml" xmlns:wp14="http://schemas.microsoft.com/office/word/2010/wordprocessingDrawing" xmlns:wp="http://schemas.openxmlformats.org/drawingml/2006/wordprocessingDrawing" xmlns:w10="urn:schemas-microsoft-com:office:word" xmlns:w="http://schemas.openxmlformats.org/wordprocessingml/2006/main" xmlns:w14="http://schemas.microsoft.com/office/word/2010/wordml" xmlns:w15="http://schemas.microsoft.com/office/word/2012/wordml" xmlns:w16cex="http://schemas.microsoft.com/office/word/2018/wordml/cex" xmlns:w16cid="http://schemas.microsoft.com/office/word/2016/wordml/cid" xmlns:w16="http://schemas.microsoft.com/office/word/2018/wordml" xmlns:w16du="http://schemas.microsoft.com/office/word/2023/wordml/word16du" xmlns:w16sdtdh="http://schemas.microsoft.com/office/word/2020/wordml/sdtdatahash" xmlns:w16se="http://schemas.microsoft.com/office/word/2015/wordml/symex" xmlns:wpg="http://schemas.microsoft.com/office/word/2010/wordprocessingGroup" xmlns:wpi="http://schemas.microsoft.com/office/word/2010/wordprocessingInk" xmlns:wne="http://schemas.microsoft.com/office/word/2006/wordml" xmlns:wps="http://schemas.microsoft.com/office/word/2010/wordprocessingShape" mc:Ignorable="w14 w15 w16se w16cid w16 w16cex w16sdtdh w16du wp14">
+<w:document xmlns:wpc="http://schemas.microsoft.com/office/word/2010/wordprocessingCanvas" xmlns:cx="http://schemas.microsoft.com/office/drawing/2014/chartex" xmlns:cx1="http://schemas.microsoft.com/office/drawing/2015/9/8/chartex" xmlns:cx2="http://schemas.microsoft.com/office/drawing/2015/10/21/chartex" xmlns:cx3="http://schemas.microsoft.com/office/drawing/2016/5/9/chartex" xmlns:cx4="http://schemas.microsoft.com/office/drawing/2016/5/10/chartex" xmlns:cx5="http://schemas.microsoft.com/office/drawing/2016/5/11/chartex" xmlns:cx6="http://schemas.microsoft.com/office/drawing/2016/5/12/chartex" xmlns:cx7="http://schemas.microsoft.com/office/drawing/2016/5/13/chartex" xmlns:cx8="http://schemas.microsoft.com/office/drawing/2016/5/14/chartex" xmlns:mc="http://schemas.openxmlformats.org/markup-compatibility/2006" xmlns:aink="http://schemas.microsoft.com/office/drawing/2016/ink" xmlns:am3d="http://schemas.microsoft.com/office/drawing/2017/model3d" xmlns:o="urn:schemas-microsoft-com:office:office" xmlns:oel="http://schemas.microsoft.com/office/2019/extlst" xmlns:r="http://schemas.openxmlformats.org/officeDocument/2006/relationships" xmlns:m="http://schemas.openxmlformats.org/officeDocument/2006/math" xmlns:v="urn:schemas-microsoft-com:vml" xmlns:wp14="http://schemas.microsoft.com/office/word/2010/wordprocessingDrawing" xmlns:wp="http://schemas.openxmlformats.org/drawingml/2006/wordprocessingDrawing" xmlns:w10="urn:schemas-microsoft-com:office:word" xmlns:w="http://schemas.openxmlformats.org/wordprocessingml/2006/main" xmlns:w14="http://schemas.microsoft.com/office/word/2010/wordml" xmlns:w15="http://schemas.microsoft.com/office/word/2012/wordml" xmlns:w16cex="http://schemas.microsoft.com/office/word/2018/wordml/cex" xmlns:w16cid="http://schemas.microsoft.com/office/word/2016/wordml/cid" xmlns:w16="http://schemas.microsoft.com/office/word/2018/wordml" xmlns:w16du="http://schemas.microsoft.com/office/word/2023/wordml/word16du" xmlns:w16sdtdh="http://schemas.microsoft.com/office/word/2020/wordml/sdtdatahash" xmlns:w16sdtfl="http://schemas.microsoft.com/office/word/2024/wordml/sdtformatlock" xmlns:w16se="http://schemas.microsoft.com/office/word/2015/wordml/symex" xmlns:wpg="http://schemas.microsoft.com/office/word/2010/wordprocessingGroup" xmlns:wpi="http://schemas.microsoft.com/office/word/2010/wordprocessingInk" xmlns:wne="http://schemas.microsoft.com/office/word/2006/wordml" xmlns:wps="http://schemas.microsoft.com/office/word/2010/wordprocessingShape" mc:Ignorable="w14 w15 w16se w16cid w16 w16cex w16sdtdh w16sdtfl w16du wp14">
   <w:body>
     <w:p>
       <w:pPr>
@@ -96,6 +96,7 @@
       <w:r>
         <w:rPr>
           <w:rFonts w:ascii="Times New Roman" w:hAnsi="Times New Roman" w:cs="Times New Roman"/>
+          <w:noProof/>
         </w:rPr>
         <w:drawing>
           <wp:inline distT="0" distB="0" distL="0" distR="0" wp14:anchorId="118E5DFF" wp14:editId="1DB8B7AF">
@@ -213,6 +214,7 @@
       <w:r>
         <w:rPr>
           <w:rFonts w:ascii="Times New Roman" w:hAnsi="Times New Roman" w:cs="Times New Roman"/>
+          <w:noProof/>
         </w:rPr>
         <w:drawing>
           <wp:inline distT="0" distB="0" distL="0" distR="0" wp14:anchorId="131F164A" wp14:editId="2AA6DAF1">
@@ -794,6 +796,7 @@
       <w:r>
         <w:rPr>
           <w:rFonts w:ascii="Times New Roman" w:hAnsi="Times New Roman" w:cs="Times New Roman"/>
+          <w:noProof/>
         </w:rPr>
         <w:drawing>
           <wp:inline distT="0" distB="0" distL="0" distR="0" wp14:anchorId="1E77E98F" wp14:editId="7947C440">
@@ -1376,6 +1379,7 @@
       <w:r>
         <w:rPr>
           <w:rFonts w:ascii="Times New Roman" w:hAnsi="Times New Roman" w:cs="Times New Roman"/>
+          <w:noProof/>
         </w:rPr>
         <w:drawing>
           <wp:inline distT="0" distB="0" distL="0" distR="0" wp14:anchorId="2B35FC1A" wp14:editId="51153A33">
@@ -1677,13 +1681,7 @@
         <w:rPr>
           <w:rFonts w:ascii="Times New Roman" w:hAnsi="Times New Roman" w:cs="Times New Roman"/>
         </w:rPr>
-        <w:t>○ Scheduling</w:t>
-      </w:r>
-      <w:r>
-        <w:rPr>
-          <w:rFonts w:ascii="Times New Roman" w:hAnsi="Times New Roman" w:cs="Times New Roman"/>
-        </w:rPr>
-        <w:t xml:space="preserve"> appointments. </w:t>
+        <w:t xml:space="preserve">○ Scheduling appointments. </w:t>
       </w:r>
     </w:p>
     <w:p>
@@ -1699,13 +1697,7 @@
           <w:rFonts w:ascii="Times New Roman" w:hAnsi="Times New Roman" w:cs="Times New Roman"/>
         </w:rPr>
         <w:lastRenderedPageBreak/>
-        <w:t>○ Recording</w:t>
-      </w:r>
-      <w:r>
-        <w:rPr>
-          <w:rFonts w:ascii="Times New Roman" w:hAnsi="Times New Roman" w:cs="Times New Roman"/>
-        </w:rPr>
-        <w:t xml:space="preserve"> and accessing appointment history. </w:t>
+        <w:t xml:space="preserve">○ Recording and accessing appointment history. </w:t>
       </w:r>
     </w:p>
     <w:p>
@@ -1761,15 +1753,7 @@
           <w:b/>
           <w:bCs/>
         </w:rPr>
-        <w:t>○ Diagnostic</w:t>
-      </w:r>
-      <w:r>
-        <w:rPr>
-          <w:rFonts w:ascii="Times New Roman" w:hAnsi="Times New Roman" w:cs="Times New Roman"/>
-          <w:b/>
-          <w:bCs/>
-        </w:rPr>
-        <w:t xml:space="preserve"> Lab Operations: </w:t>
+        <w:t xml:space="preserve">○ Diagnostic Lab Operations: </w:t>
       </w:r>
     </w:p>
     <w:p>
@@ -1807,13 +1791,7 @@
         <w:rPr>
           <w:rFonts w:ascii="Times New Roman" w:hAnsi="Times New Roman" w:cs="Times New Roman"/>
         </w:rPr>
-        <w:t>C</w:t>
-      </w:r>
-      <w:r>
-        <w:rPr>
-          <w:rFonts w:ascii="Times New Roman" w:hAnsi="Times New Roman" w:cs="Times New Roman"/>
-        </w:rPr>
-        <w:t xml:space="preserve">ollaborate with hospitals and patients for sample collection and analysis. </w:t>
+        <w:t xml:space="preserve">Collaborate with hospitals and patients for sample collection and analysis. </w:t>
       </w:r>
     </w:p>
     <w:p>
@@ -1832,15 +1810,7 @@
           <w:b/>
           <w:bCs/>
         </w:rPr>
-        <w:t>○ Process</w:t>
-      </w:r>
-      <w:r>
-        <w:rPr>
-          <w:rFonts w:ascii="Times New Roman" w:hAnsi="Times New Roman" w:cs="Times New Roman"/>
-          <w:b/>
-          <w:bCs/>
-        </w:rPr>
-        <w:t xml:space="preserve"> Lab Reports: </w:t>
+        <w:t xml:space="preserve">○ Process Lab Reports: </w:t>
       </w:r>
     </w:p>
     <w:p>
@@ -1912,13 +1882,7 @@
         <w:rPr>
           <w:rFonts w:ascii="Times New Roman" w:hAnsi="Times New Roman" w:cs="Times New Roman"/>
         </w:rPr>
-        <w:t>○ Efficient</w:t>
-      </w:r>
-      <w:r>
-        <w:rPr>
-          <w:rFonts w:ascii="Times New Roman" w:hAnsi="Times New Roman" w:cs="Times New Roman"/>
-        </w:rPr>
-        <w:t xml:space="preserve"> diagnostic test management. </w:t>
+        <w:t xml:space="preserve">○ Efficient diagnostic test management. </w:t>
       </w:r>
     </w:p>
     <w:p>
@@ -1933,13 +1897,7 @@
         <w:rPr>
           <w:rFonts w:ascii="Times New Roman" w:hAnsi="Times New Roman" w:cs="Times New Roman"/>
         </w:rPr>
-        <w:t>○ Report</w:t>
-      </w:r>
-      <w:r>
-        <w:rPr>
-          <w:rFonts w:ascii="Times New Roman" w:hAnsi="Times New Roman" w:cs="Times New Roman"/>
-        </w:rPr>
-        <w:t xml:space="preserve"> generation and communication to relevant stakeholders. </w:t>
+        <w:t xml:space="preserve">○ Report generation and communication to relevant stakeholders. </w:t>
       </w:r>
     </w:p>
     <w:p>
@@ -1995,15 +1953,7 @@
           <w:b/>
           <w:bCs/>
         </w:rPr>
-        <w:t>○ Pharmacy</w:t>
-      </w:r>
-      <w:r>
-        <w:rPr>
-          <w:rFonts w:ascii="Times New Roman" w:hAnsi="Times New Roman" w:cs="Times New Roman"/>
-          <w:b/>
-          <w:bCs/>
-        </w:rPr>
-        <w:t xml:space="preserve"> Inventory Management: </w:t>
+        <w:t xml:space="preserve">○ Pharmacy Inventory Management: </w:t>
       </w:r>
     </w:p>
     <w:p>
@@ -2060,15 +2010,7 @@
           <w:b/>
           <w:bCs/>
         </w:rPr>
-        <w:t>○ Track</w:t>
-      </w:r>
-      <w:r>
-        <w:rPr>
-          <w:rFonts w:ascii="Times New Roman" w:hAnsi="Times New Roman" w:cs="Times New Roman"/>
-          <w:b/>
-          <w:bCs/>
-        </w:rPr>
-        <w:t xml:space="preserve"> Medicine Stock: </w:t>
+        <w:t xml:space="preserve">○ Track Medicine Stock: </w:t>
       </w:r>
     </w:p>
     <w:p>
@@ -2125,15 +2067,7 @@
           <w:b/>
           <w:bCs/>
         </w:rPr>
-        <w:t>○ Process</w:t>
-      </w:r>
-      <w:r>
-        <w:rPr>
-          <w:rFonts w:ascii="Times New Roman" w:hAnsi="Times New Roman" w:cs="Times New Roman"/>
-          <w:b/>
-          <w:bCs/>
-        </w:rPr>
-        <w:t xml:space="preserve"> Prescription: </w:t>
+        <w:t xml:space="preserve">○ Process Prescription: </w:t>
       </w:r>
     </w:p>
     <w:p>
@@ -2706,6 +2640,7 @@
       <w:r>
         <w:rPr>
           <w:rFonts w:ascii="Times New Roman" w:hAnsi="Times New Roman" w:cs="Times New Roman"/>
+          <w:noProof/>
         </w:rPr>
         <w:drawing>
           <wp:inline distT="0" distB="0" distL="0" distR="0" wp14:anchorId="46829134" wp14:editId="1A095B9F">
@@ -3007,6 +2942,7 @@
       <w:r>
         <w:rPr>
           <w:rFonts w:ascii="Times New Roman" w:hAnsi="Times New Roman" w:cs="Times New Roman"/>
+          <w:noProof/>
         </w:rPr>
         <w:drawing>
           <wp:inline distT="0" distB="0" distL="0" distR="0" wp14:anchorId="5434D4EC" wp14:editId="09D949AA">
@@ -3271,91 +3207,6 @@
         <w:t xml:space="preserve">Integrated payment solutions support all entities in the ecosystem. </w:t>
       </w:r>
     </w:p>
-    <w:p>
-      <w:pPr>
-        <w:spacing w:line="360" w:lineRule="auto"/>
-        <w:rPr>
-          <w:rFonts w:ascii="Times New Roman" w:hAnsi="Times New Roman" w:cs="Times New Roman"/>
-        </w:rPr>
-      </w:pPr>
-      <w:r>
-        <w:rPr>
-          <w:rFonts w:ascii="Times New Roman" w:hAnsi="Times New Roman" w:cs="Times New Roman"/>
-        </w:rPr>
-        <w:fldChar w:fldCharType="begin"/>
-      </w:r>
-      <w:r>
-        <w:rPr>
-          <w:rFonts w:ascii="Times New Roman" w:hAnsi="Times New Roman" w:cs="Times New Roman"/>
-        </w:rPr>
-        <w:instrText xml:space="preserve"> INCLUDEPICTURE "/Users/AnjanaSruthiR/Library/Group Containers/UBF8T346G9.ms/WebArchiveCopyPasteTempFiles/com.microsoft.Word/page6image11881936" \* MERGEFORMATINET </w:instrText>
-      </w:r>
-      <w:r>
-        <w:rPr>
-          <w:rFonts w:ascii="Times New Roman" w:hAnsi="Times New Roman" w:cs="Times New Roman"/>
-        </w:rPr>
-        <w:fldChar w:fldCharType="separate"/>
-      </w:r>
-      <w:r>
-        <w:rPr>
-          <w:rFonts w:ascii="Times New Roman" w:hAnsi="Times New Roman" w:cs="Times New Roman"/>
-        </w:rPr>
-        <w:drawing>
-          <wp:inline distT="0" distB="0" distL="0" distR="0" wp14:anchorId="7AB81083" wp14:editId="025E5FE3">
-            <wp:extent cx="5880100" cy="12700"/>
-            <wp:effectExtent l="0" t="0" r="0" b="0"/>
-            <wp:docPr id="763163386" name="Picture 13" descr="page6image11881936"/>
-            <wp:cNvGraphicFramePr>
-              <a:graphicFrameLocks xmlns:a="http://schemas.openxmlformats.org/drawingml/2006/main" noChangeAspect="1"/>
-            </wp:cNvGraphicFramePr>
-            <a:graphic xmlns:a="http://schemas.openxmlformats.org/drawingml/2006/main">
-              <a:graphicData uri="http://schemas.openxmlformats.org/drawingml/2006/picture">
-                <pic:pic xmlns:pic="http://schemas.openxmlformats.org/drawingml/2006/picture">
-                  <pic:nvPicPr>
-                    <pic:cNvPr id="0" name="Picture 51" descr="page6image11881936"/>
-                    <pic:cNvPicPr>
-                      <a:picLocks noChangeAspect="1" noChangeArrowheads="1"/>
-                    </pic:cNvPicPr>
-                  </pic:nvPicPr>
-                  <pic:blipFill>
-                    <a:blip r:embed="rId5">
-                      <a:extLst>
-                        <a:ext uri="{28A0092B-C50C-407E-A947-70E740481C1C}">
-                          <a14:useLocalDpi xmlns:a14="http://schemas.microsoft.com/office/drawing/2010/main" val="0"/>
-                        </a:ext>
-                      </a:extLst>
-                    </a:blip>
-                    <a:srcRect/>
-                    <a:stretch>
-                      <a:fillRect/>
-                    </a:stretch>
-                  </pic:blipFill>
-                  <pic:spPr bwMode="auto">
-                    <a:xfrm>
-                      <a:off x="0" y="0"/>
-                      <a:ext cx="5880100" cy="12700"/>
-                    </a:xfrm>
-                    <a:prstGeom prst="rect">
-                      <a:avLst/>
-                    </a:prstGeom>
-                    <a:noFill/>
-                    <a:ln>
-                      <a:noFill/>
-                    </a:ln>
-                  </pic:spPr>
-                </pic:pic>
-              </a:graphicData>
-            </a:graphic>
-          </wp:inline>
-        </w:drawing>
-      </w:r>
-      <w:r>
-        <w:rPr>
-          <w:rFonts w:ascii="Times New Roman" w:hAnsi="Times New Roman" w:cs="Times New Roman"/>
-        </w:rPr>
-        <w:fldChar w:fldCharType="end"/>
-      </w:r>
-    </w:p>
     <w:sectPr>
       <w:pgSz w:w="12240" w:h="15840"/>
       <w:pgMar w:top="1440" w:right="1440" w:bottom="1440" w:left="1440" w:header="720" w:footer="720" w:gutter="0"/>
@@ -3367,7 +3218,7 @@
 </file>
 
 <file path=word/numbering.xml><?xml version="1.0" encoding="utf-8"?>
-<w:numbering xmlns:wpc="http://schemas.microsoft.com/office/word/2010/wordprocessingCanvas" xmlns:cx="http://schemas.microsoft.com/office/drawing/2014/chartex" xmlns:cx1="http://schemas.microsoft.com/office/drawing/2015/9/8/chartex" xmlns:cx2="http://schemas.microsoft.com/office/drawing/2015/10/21/chartex" xmlns:cx3="http://schemas.microsoft.com/office/drawing/2016/5/9/chartex" xmlns:cx4="http://schemas.microsoft.com/office/drawing/2016/5/10/chartex" xmlns:cx5="http://schemas.microsoft.com/office/drawing/2016/5/11/chartex" xmlns:cx6="http://schemas.microsoft.com/office/drawing/2016/5/12/chartex" xmlns:cx7="http://schemas.microsoft.com/office/drawing/2016/5/13/chartex" xmlns:cx8="http://schemas.microsoft.com/office/drawing/2016/5/14/chartex" xmlns:mc="http://schemas.openxmlformats.org/markup-compatibility/2006" xmlns:aink="http://schemas.microsoft.com/office/drawing/2016/ink" xmlns:am3d="http://schemas.microsoft.com/office/drawing/2017/model3d" xmlns:o="urn:schemas-microsoft-com:office:office" xmlns:oel="http://schemas.microsoft.com/office/2019/extlst" xmlns:r="http://schemas.openxmlformats.org/officeDocument/2006/relationships" xmlns:m="http://schemas.openxmlformats.org/officeDocument/2006/math" xmlns:v="urn:schemas-microsoft-com:vml" xmlns:wp14="http://schemas.microsoft.com/office/word/2010/wordprocessingDrawing" xmlns:wp="http://schemas.openxmlformats.org/drawingml/2006/wordprocessingDrawing" xmlns:w10="urn:schemas-microsoft-com:office:word" xmlns:w="http://schemas.openxmlformats.org/wordprocessingml/2006/main" xmlns:w14="http://schemas.microsoft.com/office/word/2010/wordml" xmlns:w15="http://schemas.microsoft.com/office/word/2012/wordml" xmlns:w16cex="http://schemas.microsoft.com/office/word/2018/wordml/cex" xmlns:w16cid="http://schemas.microsoft.com/office/word/2016/wordml/cid" xmlns:w16="http://schemas.microsoft.com/office/word/2018/wordml" xmlns:w16du="http://schemas.microsoft.com/office/word/2023/wordml/word16du" xmlns:w16sdtdh="http://schemas.microsoft.com/office/word/2020/wordml/sdtdatahash" xmlns:w16se="http://schemas.microsoft.com/office/word/2015/wordml/symex" xmlns:wpg="http://schemas.microsoft.com/office/word/2010/wordprocessingGroup" xmlns:wpi="http://schemas.microsoft.com/office/word/2010/wordprocessingInk" xmlns:wne="http://schemas.microsoft.com/office/word/2006/wordml" xmlns:wps="http://schemas.microsoft.com/office/word/2010/wordprocessingShape" mc:Ignorable="w14 w15 w16se w16cid w16 w16cex w16sdtdh w16du wp14">
+<w:numbering xmlns:wpc="http://schemas.microsoft.com/office/word/2010/wordprocessingCanvas" xmlns:cx="http://schemas.microsoft.com/office/drawing/2014/chartex" xmlns:cx1="http://schemas.microsoft.com/office/drawing/2015/9/8/chartex" xmlns:cx2="http://schemas.microsoft.com/office/drawing/2015/10/21/chartex" xmlns:cx3="http://schemas.microsoft.com/office/drawing/2016/5/9/chartex" xmlns:cx4="http://schemas.microsoft.com/office/drawing/2016/5/10/chartex" xmlns:cx5="http://schemas.microsoft.com/office/drawing/2016/5/11/chartex" xmlns:cx6="http://schemas.microsoft.com/office/drawing/2016/5/12/chartex" xmlns:cx7="http://schemas.microsoft.com/office/drawing/2016/5/13/chartex" xmlns:cx8="http://schemas.microsoft.com/office/drawing/2016/5/14/chartex" xmlns:mc="http://schemas.openxmlformats.org/markup-compatibility/2006" xmlns:aink="http://schemas.microsoft.com/office/drawing/2016/ink" xmlns:am3d="http://schemas.microsoft.com/office/drawing/2017/model3d" xmlns:o="urn:schemas-microsoft-com:office:office" xmlns:oel="http://schemas.microsoft.com/office/2019/extlst" xmlns:r="http://schemas.openxmlformats.org/officeDocument/2006/relationships" xmlns:m="http://schemas.openxmlformats.org/officeDocument/2006/math" xmlns:v="urn:schemas-microsoft-com:vml" xmlns:wp14="http://schemas.microsoft.com/office/word/2010/wordprocessingDrawing" xmlns:wp="http://schemas.openxmlformats.org/drawingml/2006/wordprocessingDrawing" xmlns:w10="urn:schemas-microsoft-com:office:word" xmlns:w="http://schemas.openxmlformats.org/wordprocessingml/2006/main" xmlns:w14="http://schemas.microsoft.com/office/word/2010/wordml" xmlns:w15="http://schemas.microsoft.com/office/word/2012/wordml" xmlns:w16cex="http://schemas.microsoft.com/office/word/2018/wordml/cex" xmlns:w16cid="http://schemas.microsoft.com/office/word/2016/wordml/cid" xmlns:w16="http://schemas.microsoft.com/office/word/2018/wordml" xmlns:w16du="http://schemas.microsoft.com/office/word/2023/wordml/word16du" xmlns:w16sdtdh="http://schemas.microsoft.com/office/word/2020/wordml/sdtdatahash" xmlns:w16sdtfl="http://schemas.microsoft.com/office/word/2024/wordml/sdtformatlock" xmlns:w16se="http://schemas.microsoft.com/office/word/2015/wordml/symex" xmlns:wpg="http://schemas.microsoft.com/office/word/2010/wordprocessingGroup" xmlns:wpi="http://schemas.microsoft.com/office/word/2010/wordprocessingInk" xmlns:wne="http://schemas.microsoft.com/office/word/2006/wordml" xmlns:wps="http://schemas.microsoft.com/office/word/2010/wordprocessingShape" mc:Ignorable="w14 w15 w16se w16cid w16 w16cex w16sdtdh w16sdtfl w16du wp14">
   <w:abstractNum w:abstractNumId="0" w15:restartNumberingAfterBreak="0">
     <w:nsid w:val="01542260"/>
     <w:multiLevelType w:val="multilevel"/>
@@ -7449,7 +7300,7 @@
 </file>
 
 <file path=word/styles.xml><?xml version="1.0" encoding="utf-8"?>
-<w:styles xmlns:mc="http://schemas.openxmlformats.org/markup-compatibility/2006" xmlns:r="http://schemas.openxmlformats.org/officeDocument/2006/relationships" xmlns:w="http://schemas.openxmlformats.org/wordprocessingml/2006/main" xmlns:w14="http://schemas.microsoft.com/office/word/2010/wordml" xmlns:w15="http://schemas.microsoft.com/office/word/2012/wordml" xmlns:w16cex="http://schemas.microsoft.com/office/word/2018/wordml/cex" xmlns:w16cid="http://schemas.microsoft.com/office/word/2016/wordml/cid" xmlns:w16="http://schemas.microsoft.com/office/word/2018/wordml" xmlns:w16du="http://schemas.microsoft.com/office/word/2023/wordml/word16du" xmlns:w16sdtdh="http://schemas.microsoft.com/office/word/2020/wordml/sdtdatahash" xmlns:w16se="http://schemas.microsoft.com/office/word/2015/wordml/symex" mc:Ignorable="w14 w15 w16se w16cid w16 w16cex w16sdtdh w16du">
+<w:styles xmlns:mc="http://schemas.openxmlformats.org/markup-compatibility/2006" xmlns:r="http://schemas.openxmlformats.org/officeDocument/2006/relationships" xmlns:w="http://schemas.openxmlformats.org/wordprocessingml/2006/main" xmlns:w14="http://schemas.microsoft.com/office/word/2010/wordml" xmlns:w15="http://schemas.microsoft.com/office/word/2012/wordml" xmlns:w16cex="http://schemas.microsoft.com/office/word/2018/wordml/cex" xmlns:w16cid="http://schemas.microsoft.com/office/word/2016/wordml/cid" xmlns:w16="http://schemas.microsoft.com/office/word/2018/wordml" xmlns:w16du="http://schemas.microsoft.com/office/word/2023/wordml/word16du" xmlns:w16sdtdh="http://schemas.microsoft.com/office/word/2020/wordml/sdtdatahash" xmlns:w16sdtfl="http://schemas.microsoft.com/office/word/2024/wordml/sdtformatlock" xmlns:w16se="http://schemas.microsoft.com/office/word/2015/wordml/symex" mc:Ignorable="w14 w15 w16se w16cid w16 w16cex w16sdtdh w16sdtfl w16du">
   <w:docDefaults>
     <w:rPrDefault>
       <w:rPr>
@@ -8051,6 +7902,7 @@
   <w:style w:type="character" w:default="1" w:styleId="DefaultParagraphFont">
     <w:name w:val="Default Paragraph Font"/>
     <w:uiPriority w:val="1"/>
+    <w:semiHidden/>
     <w:unhideWhenUsed/>
   </w:style>
   <w:style w:type="table" w:default="1" w:styleId="TableNormal">

</xml_diff>